<commit_message>
Simplify Frindle writing prompts for ESL production ability
Word banks now use common A2-level vocabulary instead of academic/
abstract words, sentence starters are direct fill-in-the-blank
templates instead of open-ended hypothetical constructions, and the
Day 7 book review target drops from 150-200 words to a scaffolded
6-8 sentences (~80-120 words) with one starter per required part.
Recognition vocab (flashcards) is unchanged — only the production
(writing) side was simplified.
</commit_message>
<xml_diff>
--- a/每日群文案-Frindle.docx
+++ b/每日群文案-Frindle.docx
@@ -104,7 +104,7 @@
           <w:color w:val="9B3A1A"/>
           <w:sz w:val="22"/>
         </w:rPr>
-        <w:t>今天的写作：如果 Nick 和 Mrs. Granger 是两种完全不同的人，你觉得他们相遇会发生什么？用英文写 3–5 句话。</w:t>
+        <w:t>今天的写作：用英文分别描述一下 Nick 和 Mrs. Granger 是什么样的人，任务卡里有词库和句型模板可以直接套用，写 3–5 句话。</w:t>
       </w:r>
     </w:p>
     <w:p/>
@@ -806,7 +806,7 @@
           <w:color w:val="9B3A1A"/>
           <w:sz w:val="22"/>
         </w:rPr>
-        <w:t>今天的写作：结营书评（150–200词）：写一篇英文书评，包括——这本书讲了什么、你最喜欢的角色是谁、你会不会推荐给朋友。</w:t>
+        <w:t>今天的写作：结营书评（6–8句话，约80–120词）：写一篇英文书评，包括——这本书讲了什么、你最喜欢的角色是谁、你会不会推荐给朋友。任务卡里有句型模板，照着填就行。</w:t>
       </w:r>
     </w:p>
     <w:p/>

</xml_diff>